<commit_message>
license every canvas component, bookmarks included
</commit_message>
<xml_diff>
--- a/docs/MemberFrame-User-Guide.docx
+++ b/docs/MemberFrame-User-Guide.docx
@@ -192,18 +192,7 @@
           <w:sz w:val="24"/>
           <w:szCs w:val="24"/>
         </w:rPr>
-        <w:t xml:space="preserve"> (done</w:t>
-      </w:r>
-      <w:bookmarkStart w:id="0" w:name="_GoBack"/>
-      <w:bookmarkEnd w:id="0"/>
-      <w:r>
-        <w:rPr>
-          <w:rFonts w:ascii="Times New Roman" w:eastAsia="Times New Roman" w:hAnsi="Times New Roman" w:cs="Times New Roman"/>
-          <w:color w:val="auto"/>
-          <w:sz w:val="24"/>
-          <w:szCs w:val="24"/>
-        </w:rPr>
-        <w:t>)</w:t>
+        <w:t xml:space="preserve"> (done)</w:t>
       </w:r>
     </w:p>
     <w:p>
@@ -241,6 +230,42 @@
         </w:rPr>
         <w:t>Password reset and email verification</w:t>
       </w:r>
+      <w:r>
+        <w:rPr>
+          <w:rFonts w:ascii="Times New Roman" w:eastAsia="Times New Roman" w:hAnsi="Times New Roman" w:cs="Times New Roman"/>
+          <w:color w:val="auto"/>
+          <w:sz w:val="24"/>
+          <w:szCs w:val="24"/>
+        </w:rPr>
+        <w:t xml:space="preserve"> </w:t>
+      </w:r>
+      <w:r>
+        <w:rPr>
+          <w:rFonts w:ascii="Times New Roman" w:eastAsia="Times New Roman" w:hAnsi="Times New Roman" w:cs="Times New Roman"/>
+          <w:color w:val="auto"/>
+          <w:sz w:val="24"/>
+          <w:szCs w:val="24"/>
+        </w:rPr>
+        <w:t>(</w:t>
+      </w:r>
+      <w:r>
+        <w:rPr>
+          <w:rFonts w:ascii="Times New Roman" w:eastAsia="Times New Roman" w:hAnsi="Times New Roman" w:cs="Times New Roman"/>
+          <w:color w:val="auto"/>
+          <w:sz w:val="24"/>
+          <w:szCs w:val="24"/>
+        </w:rPr>
+        <w:t>Done</w:t>
+      </w:r>
+      <w:r>
+        <w:rPr>
+          <w:rFonts w:ascii="Times New Roman" w:eastAsia="Times New Roman" w:hAnsi="Times New Roman" w:cs="Times New Roman"/>
+          <w:color w:val="auto"/>
+          <w:sz w:val="24"/>
+          <w:szCs w:val="24"/>
+        </w:rPr>
+        <w:t>)</w:t>
+      </w:r>
     </w:p>
     <w:p>
       <w:pPr>
@@ -265,6 +290,15 @@
         </w:rPr>
         <w:t>Membership tiers: Free plus paid plans with monthly, yearly or lifetime prices</w:t>
       </w:r>
+      <w:r>
+        <w:rPr>
+          <w:rFonts w:ascii="Times New Roman" w:eastAsia="Times New Roman" w:hAnsi="Times New Roman" w:cs="Times New Roman"/>
+          <w:color w:val="auto"/>
+          <w:sz w:val="24"/>
+          <w:szCs w:val="24"/>
+        </w:rPr>
+        <w:t xml:space="preserve"> (Done)</w:t>
+      </w:r>
     </w:p>
     <w:p>
       <w:pPr>
@@ -300,6 +334,15 @@
         <w:t>Razorpay</w:t>
       </w:r>
       <w:proofErr w:type="spellEnd"/>
+      <w:r>
+        <w:rPr>
+          <w:rFonts w:ascii="Times New Roman" w:eastAsia="Times New Roman" w:hAnsi="Times New Roman" w:cs="Times New Roman"/>
+          <w:color w:val="auto"/>
+          <w:sz w:val="24"/>
+          <w:szCs w:val="24"/>
+        </w:rPr>
+        <w:t xml:space="preserve"> (Done)</w:t>
+      </w:r>
     </w:p>
     <w:p>
       <w:pPr>
@@ -348,6 +391,15 @@
         </w:rPr>
         <w:t>Page locks: make whole pages members-only, by tier</w:t>
       </w:r>
+      <w:r>
+        <w:rPr>
+          <w:rFonts w:ascii="Times New Roman" w:eastAsia="Times New Roman" w:hAnsi="Times New Roman" w:cs="Times New Roman"/>
+          <w:color w:val="auto"/>
+          <w:sz w:val="24"/>
+          <w:szCs w:val="24"/>
+        </w:rPr>
+        <w:t xml:space="preserve"> (Done)</w:t>
+      </w:r>
     </w:p>
     <w:p>
       <w:pPr>
@@ -372,6 +424,15 @@
         </w:rPr>
         <w:t>Section locks: hide sections from visitors without access</w:t>
       </w:r>
+      <w:r>
+        <w:rPr>
+          <w:rFonts w:ascii="Times New Roman" w:eastAsia="Times New Roman" w:hAnsi="Times New Roman" w:cs="Times New Roman"/>
+          <w:color w:val="auto"/>
+          <w:sz w:val="24"/>
+          <w:szCs w:val="24"/>
+        </w:rPr>
+        <w:t xml:space="preserve"> (Done)</w:t>
+      </w:r>
     </w:p>
     <w:p>
       <w:pPr>
@@ -416,6 +477,15 @@
         </w:rPr>
         <w:t xml:space="preserve"> reads, then sign up</w:t>
       </w:r>
+      <w:r>
+        <w:rPr>
+          <w:rFonts w:ascii="Times New Roman" w:eastAsia="Times New Roman" w:hAnsi="Times New Roman" w:cs="Times New Roman"/>
+          <w:color w:val="auto"/>
+          <w:sz w:val="24"/>
+          <w:szCs w:val="24"/>
+        </w:rPr>
+        <w:t xml:space="preserve"> (Done)</w:t>
+      </w:r>
     </w:p>
     <w:p>
       <w:pPr>
@@ -440,6 +510,15 @@
         </w:rPr>
         <w:t>Protected file downloads for members</w:t>
       </w:r>
+      <w:r>
+        <w:rPr>
+          <w:rFonts w:ascii="Times New Roman" w:eastAsia="Times New Roman" w:hAnsi="Times New Roman" w:cs="Times New Roman"/>
+          <w:color w:val="auto"/>
+          <w:sz w:val="24"/>
+          <w:szCs w:val="24"/>
+        </w:rPr>
+        <w:t xml:space="preserve"> (Download)</w:t>
+      </w:r>
     </w:p>
     <w:p>
       <w:pPr>
@@ -464,6 +543,15 @@
         </w:rPr>
         <w:t>Member dashboard: profile, plan, billing, cancel and resume</w:t>
       </w:r>
+      <w:r>
+        <w:rPr>
+          <w:rFonts w:ascii="Times New Roman" w:eastAsia="Times New Roman" w:hAnsi="Times New Roman" w:cs="Times New Roman"/>
+          <w:color w:val="auto"/>
+          <w:sz w:val="24"/>
+          <w:szCs w:val="24"/>
+        </w:rPr>
+        <w:t xml:space="preserve"> (Done)</w:t>
+      </w:r>
     </w:p>
     <w:p>
       <w:pPr>
@@ -488,6 +576,15 @@
         </w:rPr>
         <w:t>Custom profile fields</w:t>
       </w:r>
+      <w:r>
+        <w:rPr>
+          <w:rFonts w:ascii="Times New Roman" w:eastAsia="Times New Roman" w:hAnsi="Times New Roman" w:cs="Times New Roman"/>
+          <w:color w:val="auto"/>
+          <w:sz w:val="24"/>
+          <w:szCs w:val="24"/>
+        </w:rPr>
+        <w:t xml:space="preserve"> (Done)</w:t>
+      </w:r>
     </w:p>
     <w:p>
       <w:pPr>
@@ -512,6 +609,15 @@
         </w:rPr>
         <w:t>Bookmarks: members save items to a personal list</w:t>
       </w:r>
+      <w:r>
+        <w:rPr>
+          <w:rFonts w:ascii="Times New Roman" w:eastAsia="Times New Roman" w:hAnsi="Times New Roman" w:cs="Times New Roman"/>
+          <w:color w:val="auto"/>
+          <w:sz w:val="24"/>
+          <w:szCs w:val="24"/>
+        </w:rPr>
+        <w:t xml:space="preserve"> (Done)</w:t>
+      </w:r>
     </w:p>
     <w:p>
       <w:pPr>
@@ -536,6 +642,15 @@
         </w:rPr>
         <w:t>Member management: search, change tier, revoke access, magic link, delete</w:t>
       </w:r>
+      <w:r>
+        <w:rPr>
+          <w:rFonts w:ascii="Times New Roman" w:eastAsia="Times New Roman" w:hAnsi="Times New Roman" w:cs="Times New Roman"/>
+          <w:color w:val="auto"/>
+          <w:sz w:val="24"/>
+          <w:szCs w:val="24"/>
+        </w:rPr>
+        <w:t xml:space="preserve"> </w:t>
+      </w:r>
     </w:p>
     <w:p>
       <w:pPr>
@@ -585,6 +700,15 @@
         </w:rPr>
         <w:t>Webhooks to send member events to other tools</w:t>
       </w:r>
+      <w:r>
+        <w:rPr>
+          <w:rFonts w:ascii="Times New Roman" w:eastAsia="Times New Roman" w:hAnsi="Times New Roman" w:cs="Times New Roman"/>
+          <w:color w:val="auto"/>
+          <w:sz w:val="24"/>
+          <w:szCs w:val="24"/>
+        </w:rPr>
+        <w:t xml:space="preserve"> (Done)</w:t>
+      </w:r>
     </w:p>
     <w:p>
       <w:pPr>
@@ -609,6 +733,26 @@
         </w:rPr>
         <w:t>Custom SMTP for your own email sender</w:t>
       </w:r>
+      <w:r>
+        <w:rPr>
+          <w:rFonts w:ascii="Times New Roman" w:eastAsia="Times New Roman" w:hAnsi="Times New Roman" w:cs="Times New Roman"/>
+          <w:color w:val="auto"/>
+          <w:sz w:val="24"/>
+          <w:szCs w:val="24"/>
+        </w:rPr>
+        <w:t xml:space="preserve"> (Done</w:t>
+      </w:r>
+      <w:bookmarkStart w:id="0" w:name="_GoBack"/>
+      <w:bookmarkEnd w:id="0"/>
+      <w:r>
+        <w:rPr>
+          <w:rFonts w:ascii="Times New Roman" w:eastAsia="Times New Roman" w:hAnsi="Times New Roman" w:cs="Times New Roman"/>
+          <w:color w:val="auto"/>
+          <w:sz w:val="24"/>
+          <w:szCs w:val="24"/>
+        </w:rPr>
+        <w:t>)</w:t>
+      </w:r>
     </w:p>
     <w:p>
       <w:pPr>
@@ -632,6 +776,15 @@
           <w:szCs w:val="24"/>
         </w:rPr>
         <w:t>Ready-made pages for sign in, sign up, reset password, dashboard and pricing</w:t>
+      </w:r>
+      <w:r>
+        <w:rPr>
+          <w:rFonts w:ascii="Times New Roman" w:eastAsia="Times New Roman" w:hAnsi="Times New Roman" w:cs="Times New Roman"/>
+          <w:color w:val="auto"/>
+          <w:sz w:val="24"/>
+          <w:szCs w:val="24"/>
+        </w:rPr>
+        <w:t xml:space="preserve"> (Done)</w:t>
       </w:r>
     </w:p>
     <w:p>

</xml_diff>